<commit_message>
Revise quotation: K2,500 build, transparent line items, FCIAZ owns infrastructure
- Build invoice reduced from K7,000 to K2,500 (further founder-friendly rate)
- Pricing table restructured to 4 columns (Item, Description, Quoted, Commercial)
- 6 originally-scoped line items at founder-friendly rates totaling K2,500
- 7 post-scope additions shown at K0 with their commercial reference values
  visible (Sanity CMS, dynamic news/events, Cloudflare migration, modern UI
  design system, multilingual translations, security hardening, PWA)
- Total commercial reference value: K25,400 (~90% founder-friendly reduction)
- Payment-terms table updated to K1,250 / K1,250 split
- Section 4.1 clarified: FCIAZ registers and maintains infrastructure accounts
  directly; Manova Labs assists with initial setup at no charge
- Pricing note paragraph rewritten to explain the founder-friendly structure
</commit_message>
<xml_diff>
--- a/docs/Manova-Labs-Quotation-FCIAZ-Website-2026.docx
+++ b/docs/Manova-Labs-Quotation-FCIAZ-Website-2026.docx
@@ -495,7 +495,7 @@
           <w:sz w:val="21"/>
           <w:rFonts w:ascii="Calibri" w:hAnsi="Calibri" w:cs="Calibri"/>
         </w:rPr>
-        <w:t>Pricing note: Manova Labs is providing this engagement at a founder-friendly rate in support of FCIAZ's mission. The total of K7,000 reflects the developer's discretionary contribution; comparable commercial website builds in Zambia are typically priced in the K180,000–K250,000 range. The reduction is applied uniformly across line items rather than as a separate discount line, so the pricing below reflects the actual effort on each component.</w:t>
+        <w:t>Pricing note: Manova Labs is providing this engagement at a deep founder-friendly rate in support of FCIAZ's public-health mission. The build invoice is K2,500. During the engagement, seven additional features were added beyond the original scope at no additional charge: Sanity CMS integration, dynamic news and events pages, Cloudflare + OpenNext deployment migration, the modern UI design system, full multilingual translations across three languages, security hardening, and PWA / favicon setup. The commercial reference value of all delivered work is approximately K25,400, so the founder-friendly reduction across the engagement is around 90%. The line items below show what was charged for each component alongside its commercial reference.</w:t>
       </w:r>
     </w:p>
     <w:p>
@@ -1286,104 +1286,54 @@
     </w:p>
     <w:tbl>
       <w:tblPr>
+        <w:tblStyle w:val="LightGrid-Accent1"/>
         <w:tblW w:type="auto" w:w="0"/>
-        <w:jc w:val="left"/>
-        <w:tblLayout w:type="fixed"/>
         <w:tblLook w:firstColumn="1" w:firstRow="1" w:lastColumn="0" w:lastRow="0" w:noHBand="0" w:noVBand="1" w:val="04A0"/>
       </w:tblPr>
       <w:tblGrid>
-        <w:gridCol w:w="4252"/>
-        <w:gridCol w:w="3685"/>
-        <w:gridCol w:w="1984"/>
+        <w:gridCol w:w="2409"/>
+        <w:gridCol w:w="2409"/>
+        <w:gridCol w:w="2409"/>
+        <w:gridCol w:w="2409"/>
       </w:tblGrid>
       <w:tr>
         <w:tc>
           <w:tcPr>
-            <w:tcW w:type="dxa" w:w="4252"/>
-            <w:shd w:val="clear" w:color="auto" w:fill="0F4C5C"/>
-            <w:tcBorders>
-              <w:top w:val="single" w:sz="4" w:color="0F4C5C"/>
-              <w:left w:val="single" w:sz="4" w:color="0F4C5C"/>
-              <w:bottom w:val="single" w:sz="4" w:color="0F4C5C"/>
-              <w:right w:val="single" w:sz="4" w:color="0F4C5C"/>
-            </w:tcBorders>
-            <w:vAlign w:val="center"/>
+            <w:tcW w:type="dxa" w:w="2409"/>
           </w:tcPr>
           <w:p>
-            <w:pPr>
-              <w:spacing w:before="80" w:after="80"/>
-              <w:jc w:val="left"/>
-            </w:pPr>
             <w:r>
-              <w:rPr>
-                <w:rFonts w:ascii="Calibri" w:hAnsi="Calibri"/>
-                <w:b/>
-                <w:i w:val="0"/>
-                <w:color w:val="FFFFFF"/>
-                <w:sz w:val="20"/>
-                <w:rFonts w:ascii="Calibri" w:hAnsi="Calibri" w:cs="Calibri"/>
-              </w:rPr>
               <w:t>Item</w:t>
             </w:r>
           </w:p>
         </w:tc>
         <w:tc>
           <w:tcPr>
-            <w:tcW w:type="dxa" w:w="3685"/>
-            <w:shd w:val="clear" w:color="auto" w:fill="0F4C5C"/>
-            <w:tcBorders>
-              <w:top w:val="single" w:sz="4" w:color="0F4C5C"/>
-              <w:left w:val="single" w:sz="4" w:color="0F4C5C"/>
-              <w:bottom w:val="single" w:sz="4" w:color="0F4C5C"/>
-              <w:right w:val="single" w:sz="4" w:color="0F4C5C"/>
-            </w:tcBorders>
-            <w:vAlign w:val="center"/>
+            <w:tcW w:type="dxa" w:w="2409"/>
           </w:tcPr>
           <w:p>
-            <w:pPr>
-              <w:spacing w:before="80" w:after="80"/>
-              <w:jc w:val="left"/>
-            </w:pPr>
             <w:r>
-              <w:rPr>
-                <w:rFonts w:ascii="Calibri" w:hAnsi="Calibri"/>
-                <w:b/>
-                <w:i w:val="0"/>
-                <w:color w:val="FFFFFF"/>
-                <w:sz w:val="20"/>
-                <w:rFonts w:ascii="Calibri" w:hAnsi="Calibri" w:cs="Calibri"/>
-              </w:rPr>
               <w:t>Description</w:t>
             </w:r>
           </w:p>
         </w:tc>
         <w:tc>
           <w:tcPr>
-            <w:tcW w:type="dxa" w:w="1984"/>
-            <w:shd w:val="clear" w:color="auto" w:fill="0F4C5C"/>
-            <w:tcBorders>
-              <w:top w:val="single" w:sz="4" w:color="0F4C5C"/>
-              <w:left w:val="single" w:sz="4" w:color="0F4C5C"/>
-              <w:bottom w:val="single" w:sz="4" w:color="0F4C5C"/>
-              <w:right w:val="single" w:sz="4" w:color="0F4C5C"/>
-            </w:tcBorders>
-            <w:vAlign w:val="center"/>
+            <w:tcW w:type="dxa" w:w="2409"/>
           </w:tcPr>
           <w:p>
-            <w:pPr>
-              <w:spacing w:before="80" w:after="80"/>
-              <w:jc w:val="right"/>
-            </w:pPr>
             <w:r>
-              <w:rPr>
-                <w:rFonts w:ascii="Calibri" w:hAnsi="Calibri"/>
-                <w:b/>
-                <w:i w:val="0"/>
-                <w:color w:val="FFFFFF"/>
-                <w:sz w:val="20"/>
-                <w:rFonts w:ascii="Calibri" w:hAnsi="Calibri" w:cs="Calibri"/>
-              </w:rPr>
-              <w:t>Amount (K)</w:t>
+              <w:t>Quoted (K)</w:t>
+            </w:r>
+          </w:p>
+        </w:tc>
+        <w:tc>
+          <w:tcPr>
+            <w:tcW w:type="dxa" w:w="2409"/>
+          </w:tcPr>
+          <w:p>
+            <w:r>
+              <w:t>Commercial reference (K)</w:t>
             </w:r>
           </w:p>
         </w:tc>
@@ -1391,85 +1341,208 @@
       <w:tr>
         <w:tc>
           <w:tcPr>
-            <w:tcW w:type="dxa" w:w="4252"/>
-            <w:tcBorders>
-              <w:top w:val="single" w:sz="4" w:color="CBD5E1"/>
-              <w:left w:val="single" w:sz="4" w:color="CBD5E1"/>
-              <w:bottom w:val="single" w:sz="4" w:color="CBD5E1"/>
-              <w:right w:val="single" w:sz="4" w:color="CBD5E1"/>
-            </w:tcBorders>
-            <w:vAlign w:val="top"/>
+            <w:tcW w:type="dxa" w:w="2409"/>
           </w:tcPr>
           <w:p>
-            <w:pPr>
-              <w:spacing w:before="60" w:after="60"/>
-            </w:pPr>
             <w:r>
-              <w:rPr>
-                <w:rFonts w:ascii="Calibri" w:hAnsi="Calibri"/>
-                <w:b/>
-                <w:i w:val="0"/>
-                <w:color w:val="1F2937"/>
-                <w:sz w:val="20"/>
-                <w:rFonts w:ascii="Calibri" w:hAnsi="Calibri" w:cs="Calibri"/>
-              </w:rPr>
-              <w:t>Discovery, architecture and responsive design</w:t>
+              <w:t>Discovery, architecture, and responsive design</w:t>
             </w:r>
           </w:p>
         </w:tc>
         <w:tc>
           <w:tcPr>
-            <w:tcW w:type="dxa" w:w="3685"/>
-            <w:tcBorders>
-              <w:top w:val="single" w:sz="4" w:color="CBD5E1"/>
-              <w:left w:val="single" w:sz="4" w:color="CBD5E1"/>
-              <w:bottom w:val="single" w:sz="4" w:color="CBD5E1"/>
-              <w:right w:val="single" w:sz="4" w:color="CBD5E1"/>
-            </w:tcBorders>
-            <w:vAlign w:val="top"/>
+            <w:tcW w:type="dxa" w:w="2409"/>
           </w:tcPr>
           <w:p>
-            <w:pPr>
-              <w:spacing w:before="60" w:after="60"/>
-            </w:pPr>
             <w:r>
-              <w:rPr>
-                <w:rFonts w:ascii="Calibri" w:hAnsi="Calibri"/>
-                <w:b w:val="0"/>
-                <w:i w:val="0"/>
-                <w:color w:val="64748B"/>
-                <w:sz w:val="20"/>
-                <w:rFonts w:ascii="Calibri" w:hAnsi="Calibri" w:cs="Calibri"/>
-              </w:rPr>
-              <w:t>Requirements workshop, sitemap, page specifications, component design, brand palette, accessibility baseline</w:t>
+              <w:t>Requirements workshop, sitemap, page specifications, component design, brand palette, accessibility baseline.</w:t>
             </w:r>
           </w:p>
         </w:tc>
         <w:tc>
           <w:tcPr>
-            <w:tcW w:type="dxa" w:w="1984"/>
-            <w:tcBorders>
-              <w:top w:val="single" w:sz="4" w:color="CBD5E1"/>
-              <w:left w:val="single" w:sz="4" w:color="CBD5E1"/>
-              <w:bottom w:val="single" w:sz="4" w:color="CBD5E1"/>
-              <w:right w:val="single" w:sz="4" w:color="CBD5E1"/>
-            </w:tcBorders>
-            <w:vAlign w:val="top"/>
+            <w:tcW w:type="dxa" w:w="2409"/>
           </w:tcPr>
           <w:p>
-            <w:pPr>
-              <w:spacing w:before="60" w:after="60"/>
-              <w:jc w:val="right"/>
-            </w:pPr>
             <w:r>
-              <w:rPr>
-                <w:rFonts w:ascii="Calibri" w:hAnsi="Calibri"/>
-                <w:b w:val="0"/>
-                <w:i w:val="0"/>
-                <w:color w:val="1F2937"/>
-                <w:sz w:val="20"/>
-                <w:rFonts w:ascii="Calibri" w:hAnsi="Calibri" w:cs="Calibri"/>
-              </w:rPr>
+              <w:t>500</w:t>
+            </w:r>
+          </w:p>
+        </w:tc>
+        <w:tc>
+          <w:tcPr>
+            <w:tcW w:type="dxa" w:w="2409"/>
+          </w:tcPr>
+          <w:p>
+            <w:r>
+              <w:t>2,500</w:t>
+            </w:r>
+          </w:p>
+        </w:tc>
+      </w:tr>
+      <w:tr>
+        <w:tc>
+          <w:tcPr>
+            <w:tcW w:type="dxa" w:w="2409"/>
+          </w:tcPr>
+          <w:p>
+            <w:r>
+              <w:t>Frontend build (11 pages, 3 locales, responsive)</w:t>
+            </w:r>
+          </w:p>
+        </w:tc>
+        <w:tc>
+          <w:tcPr>
+            <w:tcW w:type="dxa" w:w="2409"/>
+          </w:tcPr>
+          <w:p>
+            <w:r>
+              <w:t>All public pages, header, footer, language switcher, mobile menu, sticky accessible navigation.</w:t>
+            </w:r>
+          </w:p>
+        </w:tc>
+        <w:tc>
+          <w:tcPr>
+            <w:tcW w:type="dxa" w:w="2409"/>
+          </w:tcPr>
+          <w:p>
+            <w:r>
+              <w:t>1,000</w:t>
+            </w:r>
+          </w:p>
+        </w:tc>
+        <w:tc>
+          <w:tcPr>
+            <w:tcW w:type="dxa" w:w="2409"/>
+          </w:tcPr>
+          <w:p>
+            <w:r>
+              <w:t>8,000</w:t>
+            </w:r>
+          </w:p>
+        </w:tc>
+      </w:tr>
+      <w:tr>
+        <w:tc>
+          <w:tcPr>
+            <w:tcW w:type="dxa" w:w="2409"/>
+          </w:tcPr>
+          <w:p>
+            <w:r>
+              <w:t>Donations page — bank + MTN MoMo + Airtel Money + Zamtel Money</w:t>
+            </w:r>
+          </w:p>
+        </w:tc>
+        <w:tc>
+          <w:tcPr>
+            <w:tcW w:type="dxa" w:w="2409"/>
+          </w:tcPr>
+          <w:p>
+            <w:r>
+              <w:t>Manual donations layout, per-provider step-by-step instructions, pending-bank-detail notice.</w:t>
+            </w:r>
+          </w:p>
+        </w:tc>
+        <w:tc>
+          <w:tcPr>
+            <w:tcW w:type="dxa" w:w="2409"/>
+          </w:tcPr>
+          <w:p>
+            <w:r>
+              <w:t>200</w:t>
+            </w:r>
+          </w:p>
+        </w:tc>
+        <w:tc>
+          <w:tcPr>
+            <w:tcW w:type="dxa" w:w="2409"/>
+          </w:tcPr>
+          <w:p>
+            <w:r>
+              <w:t>1,000</w:t>
+            </w:r>
+          </w:p>
+        </w:tc>
+      </w:tr>
+      <w:tr>
+        <w:tc>
+          <w:tcPr>
+            <w:tcW w:type="dxa" w:w="2409"/>
+          </w:tcPr>
+          <w:p>
+            <w:r>
+              <w:t>Forms and backend (newsletter, contact, volunteer)</w:t>
+            </w:r>
+          </w:p>
+        </w:tc>
+        <w:tc>
+          <w:tcPr>
+            <w:tcW w:type="dxa" w:w="2409"/>
+          </w:tcPr>
+          <w:p>
+            <w:r>
+              <w:t>Self-hosted Supabase storage, Resend transactional email, server actions with Zod validation, WhatsApp floating button.</w:t>
+            </w:r>
+          </w:p>
+        </w:tc>
+        <w:tc>
+          <w:tcPr>
+            <w:tcW w:type="dxa" w:w="2409"/>
+          </w:tcPr>
+          <w:p>
+            <w:r>
+              <w:t>300</w:t>
+            </w:r>
+          </w:p>
+        </w:tc>
+        <w:tc>
+          <w:tcPr>
+            <w:tcW w:type="dxa" w:w="2409"/>
+          </w:tcPr>
+          <w:p>
+            <w:r>
+              <w:t>1,500</w:t>
+            </w:r>
+          </w:p>
+        </w:tc>
+      </w:tr>
+      <w:tr>
+        <w:tc>
+          <w:tcPr>
+            <w:tcW w:type="dxa" w:w="2409"/>
+          </w:tcPr>
+          <w:p>
+            <w:r>
+              <w:t>SEO, accessibility, performance, deployment</w:t>
+            </w:r>
+          </w:p>
+        </w:tc>
+        <w:tc>
+          <w:tcPr>
+            <w:tcW w:type="dxa" w:w="2409"/>
+          </w:tcPr>
+          <w:p>
+            <w:r>
+              <w:t>Per-locale metadata, OG image, robots.txt, semantic HTML, static pre-rendering, Cloudflare Workers setup.</w:t>
+            </w:r>
+          </w:p>
+        </w:tc>
+        <w:tc>
+          <w:tcPr>
+            <w:tcW w:type="dxa" w:w="2409"/>
+          </w:tcPr>
+          <w:p>
+            <w:r>
+              <w:t>300</w:t>
+            </w:r>
+          </w:p>
+        </w:tc>
+        <w:tc>
+          <w:tcPr>
+            <w:tcW w:type="dxa" w:w="2409"/>
+          </w:tcPr>
+          <w:p>
+            <w:r>
               <w:t>1,200</w:t>
             </w:r>
           </w:p>
@@ -1478,259 +1551,40 @@
       <w:tr>
         <w:tc>
           <w:tcPr>
-            <w:tcW w:type="dxa" w:w="4252"/>
-            <w:tcBorders>
-              <w:top w:val="single" w:sz="4" w:color="CBD5E1"/>
-              <w:left w:val="single" w:sz="4" w:color="CBD5E1"/>
-              <w:bottom w:val="single" w:sz="4" w:color="CBD5E1"/>
-              <w:right w:val="single" w:sz="4" w:color="CBD5E1"/>
-            </w:tcBorders>
-            <w:vAlign w:val="top"/>
+            <w:tcW w:type="dxa" w:w="2409"/>
           </w:tcPr>
           <w:p>
-            <w:pPr>
-              <w:spacing w:before="60" w:after="60"/>
-            </w:pPr>
             <w:r>
-              <w:rPr>
-                <w:rFonts w:ascii="Calibri" w:hAnsi="Calibri"/>
-                <w:b/>
-                <w:i w:val="0"/>
-                <w:color w:val="1F2937"/>
-                <w:sz w:val="20"/>
-                <w:rFonts w:ascii="Calibri" w:hAnsi="Calibri" w:cs="Calibri"/>
-              </w:rPr>
-              <w:t>Frontend build (11 pages, 3 locales, responsive)</w:t>
+              <w:t>Documentation, handoff, and 30-day post-launch support</w:t>
             </w:r>
           </w:p>
         </w:tc>
         <w:tc>
           <w:tcPr>
-            <w:tcW w:type="dxa" w:w="3685"/>
-            <w:tcBorders>
-              <w:top w:val="single" w:sz="4" w:color="CBD5E1"/>
-              <w:left w:val="single" w:sz="4" w:color="CBD5E1"/>
-              <w:bottom w:val="single" w:sz="4" w:color="CBD5E1"/>
-              <w:right w:val="single" w:sz="4" w:color="CBD5E1"/>
-            </w:tcBorders>
-            <w:vAlign w:val="top"/>
+            <w:tcW w:type="dxa" w:w="2409"/>
           </w:tcPr>
           <w:p>
-            <w:pPr>
-              <w:spacing w:before="60" w:after="60"/>
-            </w:pPr>
             <w:r>
-              <w:rPr>
-                <w:rFonts w:ascii="Calibri" w:hAnsi="Calibri"/>
-                <w:b w:val="0"/>
-                <w:i w:val="0"/>
-                <w:color w:val="64748B"/>
-                <w:sz w:val="20"/>
-                <w:rFonts w:ascii="Calibri" w:hAnsi="Calibri" w:cs="Calibri"/>
-              </w:rPr>
-              <w:t>All public pages, header, footer, language switcher, mobile menu, sticky accessible navigation</w:t>
+              <w:t>README, .env.example, Supabase schema, hand-off notes, plus 30 days of bug fixes and minor copy edits.</w:t>
             </w:r>
           </w:p>
         </w:tc>
         <w:tc>
           <w:tcPr>
-            <w:tcW w:type="dxa" w:w="1984"/>
-            <w:tcBorders>
-              <w:top w:val="single" w:sz="4" w:color="CBD5E1"/>
-              <w:left w:val="single" w:sz="4" w:color="CBD5E1"/>
-              <w:bottom w:val="single" w:sz="4" w:color="CBD5E1"/>
-              <w:right w:val="single" w:sz="4" w:color="CBD5E1"/>
-            </w:tcBorders>
-            <w:vAlign w:val="top"/>
+            <w:tcW w:type="dxa" w:w="2409"/>
           </w:tcPr>
           <w:p>
-            <w:pPr>
-              <w:spacing w:before="60" w:after="60"/>
-              <w:jc w:val="right"/>
-            </w:pPr>
             <w:r>
-              <w:rPr>
-                <w:rFonts w:ascii="Calibri" w:hAnsi="Calibri"/>
-                <w:b w:val="0"/>
-                <w:i w:val="0"/>
-                <w:color w:val="1F2937"/>
-                <w:sz w:val="20"/>
-                <w:rFonts w:ascii="Calibri" w:hAnsi="Calibri" w:cs="Calibri"/>
-              </w:rPr>
-              <w:t>3,200</w:t>
-            </w:r>
-          </w:p>
-        </w:tc>
-      </w:tr>
-      <w:tr>
-        <w:tc>
-          <w:tcPr>
-            <w:tcW w:type="dxa" w:w="4252"/>
-            <w:tcBorders>
-              <w:top w:val="single" w:sz="4" w:color="CBD5E1"/>
-              <w:left w:val="single" w:sz="4" w:color="CBD5E1"/>
-              <w:bottom w:val="single" w:sz="4" w:color="CBD5E1"/>
-              <w:right w:val="single" w:sz="4" w:color="CBD5E1"/>
-            </w:tcBorders>
-            <w:vAlign w:val="top"/>
-          </w:tcPr>
-          <w:p>
-            <w:pPr>
-              <w:spacing w:before="60" w:after="60"/>
-            </w:pPr>
-            <w:r>
-              <w:rPr>
-                <w:rFonts w:ascii="Calibri" w:hAnsi="Calibri"/>
-                <w:b/>
-                <w:i w:val="0"/>
-                <w:color w:val="1F2937"/>
-                <w:sz w:val="20"/>
-                <w:rFonts w:ascii="Calibri" w:hAnsi="Calibri" w:cs="Calibri"/>
-              </w:rPr>
-              <w:t>Donations page — bank + MTN MoMo + Airtel Money + Zamtel Money</w:t>
+              <w:t>200</w:t>
             </w:r>
           </w:p>
         </w:tc>
         <w:tc>
           <w:tcPr>
-            <w:tcW w:type="dxa" w:w="3685"/>
-            <w:tcBorders>
-              <w:top w:val="single" w:sz="4" w:color="CBD5E1"/>
-              <w:left w:val="single" w:sz="4" w:color="CBD5E1"/>
-              <w:bottom w:val="single" w:sz="4" w:color="CBD5E1"/>
-              <w:right w:val="single" w:sz="4" w:color="CBD5E1"/>
-            </w:tcBorders>
-            <w:vAlign w:val="top"/>
+            <w:tcW w:type="dxa" w:w="2409"/>
           </w:tcPr>
           <w:p>
-            <w:pPr>
-              <w:spacing w:before="60" w:after="60"/>
-            </w:pPr>
             <w:r>
-              <w:rPr>
-                <w:rFonts w:ascii="Calibri" w:hAnsi="Calibri"/>
-                <w:b w:val="0"/>
-                <w:i w:val="0"/>
-                <w:color w:val="64748B"/>
-                <w:sz w:val="20"/>
-                <w:rFonts w:ascii="Calibri" w:hAnsi="Calibri" w:cs="Calibri"/>
-              </w:rPr>
-              <w:t>Manual donations layout, per-provider step-by-step instructions, pending-bank-detail notice</w:t>
-            </w:r>
-          </w:p>
-        </w:tc>
-        <w:tc>
-          <w:tcPr>
-            <w:tcW w:type="dxa" w:w="1984"/>
-            <w:tcBorders>
-              <w:top w:val="single" w:sz="4" w:color="CBD5E1"/>
-              <w:left w:val="single" w:sz="4" w:color="CBD5E1"/>
-              <w:bottom w:val="single" w:sz="4" w:color="CBD5E1"/>
-              <w:right w:val="single" w:sz="4" w:color="CBD5E1"/>
-            </w:tcBorders>
-            <w:vAlign w:val="top"/>
-          </w:tcPr>
-          <w:p>
-            <w:pPr>
-              <w:spacing w:before="60" w:after="60"/>
-              <w:jc w:val="right"/>
-            </w:pPr>
-            <w:r>
-              <w:rPr>
-                <w:rFonts w:ascii="Calibri" w:hAnsi="Calibri"/>
-                <w:b w:val="0"/>
-                <w:i w:val="0"/>
-                <w:color w:val="1F2937"/>
-                <w:sz w:val="20"/>
-                <w:rFonts w:ascii="Calibri" w:hAnsi="Calibri" w:cs="Calibri"/>
-              </w:rPr>
-              <w:t>500</w:t>
-            </w:r>
-          </w:p>
-        </w:tc>
-      </w:tr>
-      <w:tr>
-        <w:tc>
-          <w:tcPr>
-            <w:tcW w:type="dxa" w:w="4252"/>
-            <w:tcBorders>
-              <w:top w:val="single" w:sz="4" w:color="CBD5E1"/>
-              <w:left w:val="single" w:sz="4" w:color="CBD5E1"/>
-              <w:bottom w:val="single" w:sz="4" w:color="CBD5E1"/>
-              <w:right w:val="single" w:sz="4" w:color="CBD5E1"/>
-            </w:tcBorders>
-            <w:vAlign w:val="top"/>
-          </w:tcPr>
-          <w:p>
-            <w:pPr>
-              <w:spacing w:before="60" w:after="60"/>
-            </w:pPr>
-            <w:r>
-              <w:rPr>
-                <w:rFonts w:ascii="Calibri" w:hAnsi="Calibri"/>
-                <w:b/>
-                <w:i w:val="0"/>
-                <w:color w:val="1F2937"/>
-                <w:sz w:val="20"/>
-                <w:rFonts w:ascii="Calibri" w:hAnsi="Calibri" w:cs="Calibri"/>
-              </w:rPr>
-              <w:t>Forms and backend (newsletter, contact, volunteer)</w:t>
-            </w:r>
-          </w:p>
-        </w:tc>
-        <w:tc>
-          <w:tcPr>
-            <w:tcW w:type="dxa" w:w="3685"/>
-            <w:tcBorders>
-              <w:top w:val="single" w:sz="4" w:color="CBD5E1"/>
-              <w:left w:val="single" w:sz="4" w:color="CBD5E1"/>
-              <w:bottom w:val="single" w:sz="4" w:color="CBD5E1"/>
-              <w:right w:val="single" w:sz="4" w:color="CBD5E1"/>
-            </w:tcBorders>
-            <w:vAlign w:val="top"/>
-          </w:tcPr>
-          <w:p>
-            <w:pPr>
-              <w:spacing w:before="60" w:after="60"/>
-            </w:pPr>
-            <w:r>
-              <w:rPr>
-                <w:rFonts w:ascii="Calibri" w:hAnsi="Calibri"/>
-                <w:b w:val="0"/>
-                <w:i w:val="0"/>
-                <w:color w:val="64748B"/>
-                <w:sz w:val="20"/>
-                <w:rFonts w:ascii="Calibri" w:hAnsi="Calibri" w:cs="Calibri"/>
-              </w:rPr>
-              <w:t>Self-hosted Supabase storage, Resend transactional email, server actions with Zod validation, WhatsApp floating button</w:t>
-            </w:r>
-          </w:p>
-        </w:tc>
-        <w:tc>
-          <w:tcPr>
-            <w:tcW w:type="dxa" w:w="1984"/>
-            <w:tcBorders>
-              <w:top w:val="single" w:sz="4" w:color="CBD5E1"/>
-              <w:left w:val="single" w:sz="4" w:color="CBD5E1"/>
-              <w:bottom w:val="single" w:sz="4" w:color="CBD5E1"/>
-              <w:right w:val="single" w:sz="4" w:color="CBD5E1"/>
-            </w:tcBorders>
-            <w:vAlign w:val="top"/>
-          </w:tcPr>
-          <w:p>
-            <w:pPr>
-              <w:spacing w:before="60" w:after="60"/>
-              <w:jc w:val="right"/>
-            </w:pPr>
-            <w:r>
-              <w:rPr>
-                <w:rFonts w:ascii="Calibri" w:hAnsi="Calibri"/>
-                <w:b w:val="0"/>
-                <w:i w:val="0"/>
-                <w:color w:val="1F2937"/>
-                <w:sz w:val="20"/>
-                <w:rFonts w:ascii="Calibri" w:hAnsi="Calibri" w:cs="Calibri"/>
-              </w:rPr>
               <w:t>800</w:t>
             </w:r>
           </w:p>
@@ -1739,85 +1593,122 @@
       <w:tr>
         <w:tc>
           <w:tcPr>
-            <w:tcW w:type="dxa" w:w="4252"/>
-            <w:tcBorders>
-              <w:top w:val="single" w:sz="4" w:color="CBD5E1"/>
-              <w:left w:val="single" w:sz="4" w:color="CBD5E1"/>
-              <w:bottom w:val="single" w:sz="4" w:color="CBD5E1"/>
-              <w:right w:val="single" w:sz="4" w:color="CBD5E1"/>
-            </w:tcBorders>
-            <w:vAlign w:val="top"/>
+            <w:tcW w:type="dxa" w:w="2409"/>
           </w:tcPr>
           <w:p>
-            <w:pPr>
-              <w:spacing w:before="60" w:after="60"/>
-            </w:pPr>
             <w:r>
-              <w:rPr>
-                <w:rFonts w:ascii="Calibri" w:hAnsi="Calibri"/>
-                <w:b/>
-                <w:i w:val="0"/>
-                <w:color w:val="1F2937"/>
-                <w:sz w:val="20"/>
-                <w:rFonts w:ascii="Calibri" w:hAnsi="Calibri" w:cs="Calibri"/>
-              </w:rPr>
-              <w:t>SEO, accessibility, performance, deployment</w:t>
+              <w:t>Subtotal — originally scoped items</w:t>
             </w:r>
           </w:p>
         </w:tc>
         <w:tc>
           <w:tcPr>
-            <w:tcW w:type="dxa" w:w="3685"/>
-            <w:tcBorders>
-              <w:top w:val="single" w:sz="4" w:color="CBD5E1"/>
-              <w:left w:val="single" w:sz="4" w:color="CBD5E1"/>
-              <w:bottom w:val="single" w:sz="4" w:color="CBD5E1"/>
-              <w:right w:val="single" w:sz="4" w:color="CBD5E1"/>
-            </w:tcBorders>
-            <w:vAlign w:val="top"/>
+            <w:tcW w:type="dxa" w:w="2409"/>
           </w:tcPr>
           <w:p>
-            <w:pPr>
-              <w:spacing w:before="60" w:after="60"/>
-            </w:pPr>
+            <w:r/>
+          </w:p>
+        </w:tc>
+        <w:tc>
+          <w:tcPr>
+            <w:tcW w:type="dxa" w:w="2409"/>
+          </w:tcPr>
+          <w:p>
             <w:r>
-              <w:rPr>
-                <w:rFonts w:ascii="Calibri" w:hAnsi="Calibri"/>
-                <w:b w:val="0"/>
-                <w:i w:val="0"/>
-                <w:color w:val="64748B"/>
-                <w:sz w:val="20"/>
-                <w:rFonts w:ascii="Calibri" w:hAnsi="Calibri" w:cs="Calibri"/>
-              </w:rPr>
-              <w:t>Per-locale metadata, OG image, robots.txt, semantic HTML, static pre-rendering of 33 routes, Vercel setup</w:t>
+              <w:t>2,500</w:t>
             </w:r>
           </w:p>
         </w:tc>
         <w:tc>
           <w:tcPr>
-            <w:tcW w:type="dxa" w:w="1984"/>
-            <w:tcBorders>
-              <w:top w:val="single" w:sz="4" w:color="CBD5E1"/>
-              <w:left w:val="single" w:sz="4" w:color="CBD5E1"/>
-              <w:bottom w:val="single" w:sz="4" w:color="CBD5E1"/>
-              <w:right w:val="single" w:sz="4" w:color="CBD5E1"/>
-            </w:tcBorders>
-            <w:vAlign w:val="top"/>
+            <w:tcW w:type="dxa" w:w="2409"/>
           </w:tcPr>
           <w:p>
-            <w:pPr>
-              <w:spacing w:before="60" w:after="60"/>
-              <w:jc w:val="right"/>
-            </w:pPr>
             <w:r>
-              <w:rPr>
-                <w:rFonts w:ascii="Calibri" w:hAnsi="Calibri"/>
-                <w:b w:val="0"/>
-                <w:i w:val="0"/>
-                <w:color w:val="1F2937"/>
-                <w:sz w:val="20"/>
-                <w:rFonts w:ascii="Calibri" w:hAnsi="Calibri" w:cs="Calibri"/>
-              </w:rPr>
+              <w:t>15,000</w:t>
+            </w:r>
+          </w:p>
+        </w:tc>
+      </w:tr>
+      <w:tr>
+        <w:tc>
+          <w:tcPr>
+            <w:tcW w:type="dxa" w:w="2409"/>
+          </w:tcPr>
+          <w:p>
+            <w:r>
+              <w:t>Sanity CMS integration (added during development)</w:t>
+            </w:r>
+          </w:p>
+        </w:tc>
+        <w:tc>
+          <w:tcPr>
+            <w:tcW w:type="dxa" w:w="2409"/>
+          </w:tcPr>
+          <w:p>
+            <w:r>
+              <w:t>Studio with i18n schemas (post, event, resource, siteSettings), GROQ queries, image pipeline, hardcoded fallback for offline operation.</w:t>
+            </w:r>
+          </w:p>
+        </w:tc>
+        <w:tc>
+          <w:tcPr>
+            <w:tcW w:type="dxa" w:w="2409"/>
+          </w:tcPr>
+          <w:p>
+            <w:r>
+              <w:t>0</w:t>
+            </w:r>
+          </w:p>
+        </w:tc>
+        <w:tc>
+          <w:tcPr>
+            <w:tcW w:type="dxa" w:w="2409"/>
+          </w:tcPr>
+          <w:p>
+            <w:r>
+              <w:t>2,500</w:t>
+            </w:r>
+          </w:p>
+        </w:tc>
+      </w:tr>
+      <w:tr>
+        <w:tc>
+          <w:tcPr>
+            <w:tcW w:type="dxa" w:w="2409"/>
+          </w:tcPr>
+          <w:p>
+            <w:r>
+              <w:t>Dynamic news and events pages (added)</w:t>
+            </w:r>
+          </w:p>
+        </w:tc>
+        <w:tc>
+          <w:tcPr>
+            <w:tcW w:type="dxa" w:w="2409"/>
+          </w:tcPr>
+          <w:p>
+            <w:r>
+              <w:t>/news/[slug] and /events/[slug] dynamic routes backed by Sanity content.</w:t>
+            </w:r>
+          </w:p>
+        </w:tc>
+        <w:tc>
+          <w:tcPr>
+            <w:tcW w:type="dxa" w:w="2409"/>
+          </w:tcPr>
+          <w:p>
+            <w:r>
+              <w:t>0</w:t>
+            </w:r>
+          </w:p>
+        </w:tc>
+        <w:tc>
+          <w:tcPr>
+            <w:tcW w:type="dxa" w:w="2409"/>
+          </w:tcPr>
+          <w:p>
+            <w:r>
               <w:t>800</w:t>
             </w:r>
           </w:p>
@@ -1826,86 +1717,41 @@
       <w:tr>
         <w:tc>
           <w:tcPr>
-            <w:tcW w:type="dxa" w:w="4252"/>
-            <w:tcBorders>
-              <w:top w:val="single" w:sz="4" w:color="CBD5E1"/>
-              <w:left w:val="single" w:sz="4" w:color="CBD5E1"/>
-              <w:bottom w:val="single" w:sz="4" w:color="CBD5E1"/>
-              <w:right w:val="single" w:sz="4" w:color="CBD5E1"/>
-            </w:tcBorders>
-            <w:vAlign w:val="top"/>
+            <w:tcW w:type="dxa" w:w="2409"/>
           </w:tcPr>
           <w:p>
-            <w:pPr>
-              <w:spacing w:before="60" w:after="60"/>
-            </w:pPr>
             <w:r>
-              <w:rPr>
-                <w:rFonts w:ascii="Calibri" w:hAnsi="Calibri"/>
-                <w:b/>
-                <w:i w:val="0"/>
-                <w:color w:val="1F2937"/>
-                <w:sz w:val="20"/>
-                <w:rFonts w:ascii="Calibri" w:hAnsi="Calibri" w:cs="Calibri"/>
-              </w:rPr>
-              <w:t>Documentation, handoff, and 30-day post-launch support</w:t>
+              <w:t>Cloudflare + OpenNext deployment migration (added)</w:t>
             </w:r>
           </w:p>
         </w:tc>
         <w:tc>
           <w:tcPr>
-            <w:tcW w:type="dxa" w:w="3685"/>
-            <w:tcBorders>
-              <w:top w:val="single" w:sz="4" w:color="CBD5E1"/>
-              <w:left w:val="single" w:sz="4" w:color="CBD5E1"/>
-              <w:bottom w:val="single" w:sz="4" w:color="CBD5E1"/>
-              <w:right w:val="single" w:sz="4" w:color="CBD5E1"/>
-            </w:tcBorders>
-            <w:vAlign w:val="top"/>
+            <w:tcW w:type="dxa" w:w="2409"/>
           </w:tcPr>
           <w:p>
-            <w:pPr>
-              <w:spacing w:before="60" w:after="60"/>
-            </w:pPr>
             <w:r>
-              <w:rPr>
-                <w:rFonts w:ascii="Calibri" w:hAnsi="Calibri"/>
-                <w:b w:val="0"/>
-                <w:i w:val="0"/>
-                <w:color w:val="64748B"/>
-                <w:sz w:val="20"/>
-                <w:rFonts w:ascii="Calibri" w:hAnsi="Calibri" w:cs="Calibri"/>
-              </w:rPr>
-              <w:t>README, .env.example, Supabase schema, hand-off notes, plus 30 days of bug fixes and minor copy edits after launch</w:t>
+              <w:t>Migrated from Vercel to Cloudflare Workers via @opennextjs/cloudflare; wrangler + open-next.config.ts; production security headers.</w:t>
             </w:r>
           </w:p>
         </w:tc>
         <w:tc>
           <w:tcPr>
-            <w:tcW w:type="dxa" w:w="1984"/>
-            <w:tcBorders>
-              <w:top w:val="single" w:sz="4" w:color="CBD5E1"/>
-              <w:left w:val="single" w:sz="4" w:color="CBD5E1"/>
-              <w:bottom w:val="single" w:sz="4" w:color="CBD5E1"/>
-              <w:right w:val="single" w:sz="4" w:color="CBD5E1"/>
-            </w:tcBorders>
-            <w:vAlign w:val="top"/>
+            <w:tcW w:type="dxa" w:w="2409"/>
           </w:tcPr>
           <w:p>
-            <w:pPr>
-              <w:spacing w:before="60" w:after="60"/>
-              <w:jc w:val="right"/>
-            </w:pPr>
             <w:r>
-              <w:rPr>
-                <w:rFonts w:ascii="Calibri" w:hAnsi="Calibri"/>
-                <w:b w:val="0"/>
-                <w:i w:val="0"/>
-                <w:color w:val="1F2937"/>
-                <w:sz w:val="20"/>
-                <w:rFonts w:ascii="Calibri" w:hAnsi="Calibri" w:cs="Calibri"/>
-              </w:rPr>
-              <w:t>500</w:t>
+              <w:t>0</w:t>
+            </w:r>
+          </w:p>
+        </w:tc>
+        <w:tc>
+          <w:tcPr>
+            <w:tcW w:type="dxa" w:w="2409"/>
+          </w:tcPr>
+          <w:p>
+            <w:r>
+              <w:t>1,500</w:t>
             </w:r>
           </w:p>
         </w:tc>
@@ -1913,60 +1759,41 @@
       <w:tr>
         <w:tc>
           <w:tcPr>
-            <w:tcW w:type="dxa" w:w="7937"/>
-            <w:shd w:val="clear" w:color="auto" w:fill="F0F7F9"/>
-            <w:gridSpan w:val="2"/>
-            <w:tcBorders>
-              <w:top w:val="single" w:sz="4" w:color="0F4C5C"/>
-              <w:left w:val="single" w:sz="4" w:color="0F4C5C"/>
-              <w:bottom w:val="single" w:sz="4" w:color="0F4C5C"/>
-              <w:right w:val="single" w:sz="4" w:color="0F4C5C"/>
-            </w:tcBorders>
+            <w:tcW w:type="dxa" w:w="2409"/>
           </w:tcPr>
           <w:p>
-            <w:pPr>
-              <w:spacing w:before="60" w:after="60"/>
-              <w:jc w:val="right"/>
-            </w:pPr>
             <w:r>
-              <w:rPr>
-                <w:rFonts w:ascii="Calibri" w:hAnsi="Calibri"/>
-                <w:b/>
-                <w:i w:val="0"/>
-                <w:color w:val="0F4C5C"/>
-                <w:sz w:val="20"/>
-                <w:rFonts w:ascii="Calibri" w:hAnsi="Calibri" w:cs="Calibri"/>
-              </w:rPr>
-              <w:t>Subtotal</w:t>
+              <w:t>Modern UI design system (added)</w:t>
             </w:r>
           </w:p>
         </w:tc>
         <w:tc>
           <w:tcPr>
-            <w:tcW w:type="dxa" w:w="1984"/>
-            <w:shd w:val="clear" w:color="auto" w:fill="F0F7F9"/>
-            <w:tcBorders>
-              <w:top w:val="single" w:sz="4" w:color="0F4C5C"/>
-              <w:left w:val="single" w:sz="4" w:color="0F4C5C"/>
-              <w:bottom w:val="single" w:sz="4" w:color="0F4C5C"/>
-              <w:right w:val="single" w:sz="4" w:color="0F4C5C"/>
-            </w:tcBorders>
+            <w:tcW w:type="dxa" w:w="2409"/>
           </w:tcPr>
           <w:p>
-            <w:pPr>
-              <w:spacing w:before="60" w:after="60"/>
-              <w:jc w:val="right"/>
-            </w:pPr>
             <w:r>
-              <w:rPr>
-                <w:rFonts w:ascii="Calibri" w:hAnsi="Calibri"/>
-                <w:b/>
-                <w:i w:val="0"/>
-                <w:color w:val="0F4C5C"/>
-                <w:sz w:val="20"/>
-                <w:rFonts w:ascii="Calibri" w:hAnsi="Calibri" w:cs="Calibri"/>
-              </w:rPr>
-              <w:t>7,000</w:t>
+              <w:t>Mesh gradients, glass cards, aurora animations, hover micro-interactions across every page.</w:t>
+            </w:r>
+          </w:p>
+        </w:tc>
+        <w:tc>
+          <w:tcPr>
+            <w:tcW w:type="dxa" w:w="2409"/>
+          </w:tcPr>
+          <w:p>
+            <w:r>
+              <w:t>0</w:t>
+            </w:r>
+          </w:p>
+        </w:tc>
+        <w:tc>
+          <w:tcPr>
+            <w:tcW w:type="dxa" w:w="2409"/>
+          </w:tcPr>
+          <w:p>
+            <w:r>
+              <w:t>2,000</w:t>
             </w:r>
           </w:p>
         </w:tc>
@@ -1974,60 +1801,209 @@
       <w:tr>
         <w:tc>
           <w:tcPr>
-            <w:tcW w:type="dxa" w:w="7937"/>
-            <w:shd w:val="clear" w:color="auto" w:fill="0F4C5C"/>
-            <w:gridSpan w:val="2"/>
-            <w:tcBorders>
-              <w:top w:val="single" w:sz="4" w:color="0F4C5C"/>
-              <w:left w:val="single" w:sz="4" w:color="0F4C5C"/>
-              <w:bottom w:val="single" w:sz="4" w:color="0F4C5C"/>
-              <w:right w:val="single" w:sz="4" w:color="0F4C5C"/>
-            </w:tcBorders>
+            <w:tcW w:type="dxa" w:w="2409"/>
           </w:tcPr>
           <w:p>
-            <w:pPr>
-              <w:spacing w:before="80" w:after="80"/>
-              <w:jc w:val="right"/>
-            </w:pPr>
             <w:r>
-              <w:rPr>
-                <w:rFonts w:ascii="Calibri" w:hAnsi="Calibri"/>
-                <w:b/>
-                <w:i w:val="0"/>
-                <w:color w:val="FFFFFF"/>
-                <w:sz w:val="24"/>
-                <w:rFonts w:ascii="Calibri" w:hAnsi="Calibri" w:cs="Calibri"/>
-              </w:rPr>
+              <w:t>Multilingual translations across three languages (added)</w:t>
+            </w:r>
+          </w:p>
+        </w:tc>
+        <w:tc>
+          <w:tcPr>
+            <w:tcW w:type="dxa" w:w="2409"/>
+          </w:tcPr>
+          <w:p>
+            <w:r>
+              <w:t>Full Bemba and Nyanja translation coverage, clinical phrasing flagged for FCIAZ review.</w:t>
+            </w:r>
+          </w:p>
+        </w:tc>
+        <w:tc>
+          <w:tcPr>
+            <w:tcW w:type="dxa" w:w="2409"/>
+          </w:tcPr>
+          <w:p>
+            <w:r>
+              <w:t>0</w:t>
+            </w:r>
+          </w:p>
+        </w:tc>
+        <w:tc>
+          <w:tcPr>
+            <w:tcW w:type="dxa" w:w="2409"/>
+          </w:tcPr>
+          <w:p>
+            <w:r>
+              <w:t>1,800</w:t>
+            </w:r>
+          </w:p>
+        </w:tc>
+      </w:tr>
+      <w:tr>
+        <w:tc>
+          <w:tcPr>
+            <w:tcW w:type="dxa" w:w="2409"/>
+          </w:tcPr>
+          <w:p>
+            <w:r>
+              <w:t>Security hardening (added)</w:t>
+            </w:r>
+          </w:p>
+        </w:tc>
+        <w:tc>
+          <w:tcPr>
+            <w:tcW w:type="dxa" w:w="2409"/>
+          </w:tcPr>
+          <w:p>
+            <w:r>
+              <w:t>CSP, HSTS, Permissions-Policy, IP-based rate limiting on forms, sanitized error logs.</w:t>
+            </w:r>
+          </w:p>
+        </w:tc>
+        <w:tc>
+          <w:tcPr>
+            <w:tcW w:type="dxa" w:w="2409"/>
+          </w:tcPr>
+          <w:p>
+            <w:r>
+              <w:t>0</w:t>
+            </w:r>
+          </w:p>
+        </w:tc>
+        <w:tc>
+          <w:tcPr>
+            <w:tcW w:type="dxa" w:w="2409"/>
+          </w:tcPr>
+          <w:p>
+            <w:r>
+              <w:t>1,200</w:t>
+            </w:r>
+          </w:p>
+        </w:tc>
+      </w:tr>
+      <w:tr>
+        <w:tc>
+          <w:tcPr>
+            <w:tcW w:type="dxa" w:w="2409"/>
+          </w:tcPr>
+          <w:p>
+            <w:r>
+              <w:t>PWA and favicon setup (added)</w:t>
+            </w:r>
+          </w:p>
+        </w:tc>
+        <w:tc>
+          <w:tcPr>
+            <w:tcW w:type="dxa" w:w="2409"/>
+          </w:tcPr>
+          <w:p>
+            <w:r>
+              <w:t>Real favicons in multiple sizes, web app manifest, installable PWA.</w:t>
+            </w:r>
+          </w:p>
+        </w:tc>
+        <w:tc>
+          <w:tcPr>
+            <w:tcW w:type="dxa" w:w="2409"/>
+          </w:tcPr>
+          <w:p>
+            <w:r>
+              <w:t>0</w:t>
+            </w:r>
+          </w:p>
+        </w:tc>
+        <w:tc>
+          <w:tcPr>
+            <w:tcW w:type="dxa" w:w="2409"/>
+          </w:tcPr>
+          <w:p>
+            <w:r>
+              <w:t>600</w:t>
+            </w:r>
+          </w:p>
+        </w:tc>
+      </w:tr>
+      <w:tr>
+        <w:tc>
+          <w:tcPr>
+            <w:tcW w:type="dxa" w:w="2409"/>
+          </w:tcPr>
+          <w:p>
+            <w:r>
+              <w:t>Subtotal — features added beyond original scope</w:t>
+            </w:r>
+          </w:p>
+        </w:tc>
+        <w:tc>
+          <w:tcPr>
+            <w:tcW w:type="dxa" w:w="2409"/>
+          </w:tcPr>
+          <w:p>
+            <w:r>
+              <w:t>At no additional charge under the founder-friendly rate.</w:t>
+            </w:r>
+          </w:p>
+        </w:tc>
+        <w:tc>
+          <w:tcPr>
+            <w:tcW w:type="dxa" w:w="2409"/>
+          </w:tcPr>
+          <w:p>
+            <w:r>
+              <w:t>0</w:t>
+            </w:r>
+          </w:p>
+        </w:tc>
+        <w:tc>
+          <w:tcPr>
+            <w:tcW w:type="dxa" w:w="2409"/>
+          </w:tcPr>
+          <w:p>
+            <w:r>
+              <w:t>10,400</w:t>
+            </w:r>
+          </w:p>
+        </w:tc>
+      </w:tr>
+      <w:tr>
+        <w:tc>
+          <w:tcPr>
+            <w:tcW w:type="dxa" w:w="2409"/>
+          </w:tcPr>
+          <w:p>
+            <w:r>
               <w:t>TOTAL</w:t>
             </w:r>
           </w:p>
         </w:tc>
         <w:tc>
           <w:tcPr>
-            <w:tcW w:type="dxa" w:w="1984"/>
-            <w:shd w:val="clear" w:color="auto" w:fill="0F4C5C"/>
-            <w:tcBorders>
-              <w:top w:val="single" w:sz="4" w:color="0F4C5C"/>
-              <w:left w:val="single" w:sz="4" w:color="0F4C5C"/>
-              <w:bottom w:val="single" w:sz="4" w:color="0F4C5C"/>
-              <w:right w:val="single" w:sz="4" w:color="0F4C5C"/>
-            </w:tcBorders>
+            <w:tcW w:type="dxa" w:w="2409"/>
           </w:tcPr>
           <w:p>
-            <w:pPr>
-              <w:spacing w:before="80" w:after="80"/>
-              <w:jc w:val="right"/>
-            </w:pPr>
             <w:r>
-              <w:rPr>
-                <w:rFonts w:ascii="Calibri" w:hAnsi="Calibri"/>
-                <w:b/>
-                <w:i w:val="0"/>
-                <w:color w:val="FFFFFF"/>
-                <w:sz w:val="24"/>
-                <w:rFonts w:ascii="Calibri" w:hAnsi="Calibri" w:cs="Calibri"/>
-              </w:rPr>
-              <w:t>K 7,000</w:t>
+              <w:t>Total amount invoiced to FCIAZ</w:t>
+            </w:r>
+          </w:p>
+        </w:tc>
+        <w:tc>
+          <w:tcPr>
+            <w:tcW w:type="dxa" w:w="2409"/>
+          </w:tcPr>
+          <w:p>
+            <w:r>
+              <w:t>K 2,500</w:t>
+            </w:r>
+          </w:p>
+        </w:tc>
+        <w:tc>
+          <w:tcPr>
+            <w:tcW w:type="dxa" w:w="2409"/>
+          </w:tcPr>
+          <w:p>
+            <w:r>
+              <w:t>K 25,400</w:t>
             </w:r>
           </w:p>
         </w:tc>
@@ -2051,7 +2027,7 @@
           <w:sz w:val="20"/>
           <w:rFonts w:ascii="Calibri" w:hAnsi="Calibri" w:cs="Calibri"/>
         </w:rPr>
-        <w:t>Total: seven thousand Zambian Kwacha (K7,000). This fee covers the developer's time and effort only and excludes VAT, hosting, and third-party service costs, which FCIAZ will cover separately.</w:t>
+        <w:t>Total: two thousand five hundred Zambian Kwacha (K2,500). This fee covers the developer's time and effort only and excludes VAT, hosting, and third-party service costs, which FCIAZ will register and maintain directly (see Section 4 for the annual cost breakdown).</w:t>
       </w:r>
     </w:p>
     <w:p>
@@ -2075,7 +2051,7 @@
     <w:p>
       <w:pPr/>
       <w:r>
-        <w:t>The following services are billed directly by their providers, not by Manova Labs. All items below are within the free tier of their respective providers as of the date of this quotation. Manova Labs will flag any move to a paid tier and obtain FCIAZ written approval before costs are incurred.</w:t>
+        <w:t>FCIAZ will register and maintain these third-party accounts directly. Manova Labs will assist with the initial setup of each one (domain registration at ZAMICA, Cloudflare Workers project, Sanity project, Supabase project, Resend account) at no additional charge. All items below are within the free tier of their respective providers as of the date of this quotation. Manova Labs will flag any move to a paid tier and obtain FCIAZ written approval before costs are incurred.</w:t>
       </w:r>
     </w:p>
     <w:tbl>
@@ -2892,20 +2868,8 @@
             </w:tcBorders>
           </w:tcPr>
           <w:p>
-            <w:pPr>
-              <w:spacing w:before="60" w:after="60"/>
-              <w:jc w:val="right"/>
-            </w:pPr>
             <w:r>
-              <w:rPr>
-                <w:rFonts w:ascii="Calibri" w:hAnsi="Calibri"/>
-                <w:b w:val="0"/>
-                <w:i w:val="0"/>
-                <w:color w:val="1F2937"/>
-                <w:sz w:val="20"/>
-                <w:rFonts w:ascii="Calibri" w:hAnsi="Calibri" w:cs="Calibri"/>
-              </w:rPr>
-              <w:t>3,500</w:t>
+              <w:t>1,250</w:t>
             </w:r>
           </w:p>
         </w:tc>
@@ -2976,20 +2940,8 @@
             </w:tcBorders>
           </w:tcPr>
           <w:p>
-            <w:pPr>
-              <w:spacing w:before="60" w:after="60"/>
-              <w:jc w:val="right"/>
-            </w:pPr>
             <w:r>
-              <w:rPr>
-                <w:rFonts w:ascii="Calibri" w:hAnsi="Calibri"/>
-                <w:b w:val="0"/>
-                <w:i w:val="0"/>
-                <w:color w:val="1F2937"/>
-                <w:sz w:val="20"/>
-                <w:rFonts w:ascii="Calibri" w:hAnsi="Calibri" w:cs="Calibri"/>
-              </w:rPr>
-              <w:t>3,500</w:t>
+              <w:t>1,250</w:t>
             </w:r>
           </w:p>
         </w:tc>
@@ -3035,7 +2987,7 @@
           <w:sz w:val="20"/>
           <w:rFonts w:ascii="Calibri" w:hAnsi="Calibri" w:cs="Calibri"/>
         </w:rPr>
-        <w:t>All invoices are payable within seven (7) days of issue. Bank details will be provided on the invoice header. Late payments accrue interest at 1.5% per month or part thereof.</w:t>
+        <w:t>All invoices are payable within seven (7) days of issue. Bank details will be provided on the invoice header. The build invoice of K2,500 was issued at launch on 25 September 2026; future maintenance packages under Section 4 are invoiced annually in advance. Late payments accrue interest at 1.5% per month or part thereof.</w:t>
       </w:r>
     </w:p>
     <w:p>

</xml_diff>